<commit_message>
docs: move Claude Code prompt to gitignored docs/CLAUDE_CODE_PROMPT.md
- Remove §18 (Claude Code Prompt) from DroidBridge_Project_Document.md
  and DroidBridge_Project_Document.docx — it is a dev aid, not public doc
- Create docs/CLAUDE_CODE_PROMPT.md with the full bootstrap prompt
- Add docs/CLAUDE_CODE_PROMPT.md to .gitignore
- Regenerate .docx from updated .md (58 KB, down from 60 KB)

Co-Authored-By: Claude Sonnet 4.6 <noreply@anthropic.com>
</commit_message>
<xml_diff>
--- a/docs/DroidBridge_Project_Document.docx
+++ b/docs/DroidBridge_Project_Document.docx
@@ -9195,246 +9195,6 @@
       </w:pPr>
       <w:r>
         <w:t>schema as a starting point, if a separate project is ever started.</w:t>
-      </w:r>
-    </w:p>
-    <w:p>
-      <w:pPr>
-        <w:spacing w:before="80" w:after="80"/>
-        <w:pBdr>
-          <w:bottom w:val="single" w:sz="6" w:space="1" w:color="AAAAAA"/>
-        </w:pBdr>
-      </w:pPr>
-    </w:p>
-    <w:p>
-      <w:pPr>
-        <w:pStyle w:val="Heading2"/>
-      </w:pPr>
-      <w:r>
-        <w:t>18. Claude Code Prompt</w:t>
-      </w:r>
-    </w:p>
-    <w:p>
-      <w:pPr>
-        <w:spacing w:after="80"/>
-      </w:pPr>
-      <w:r>
-        <w:t>Use the following prompt when initiating the DroidBridge project with Claude Code CLI. It instructs Claude Code to follow the phased plan above, starting with Phase 1.</w:t>
-      </w:r>
-    </w:p>
-    <w:p>
-      <w:pPr>
-        <w:spacing w:before="80" w:after="80"/>
-        <w:ind w:left="360"/>
-      </w:pPr>
-      <w:r>
-        <w:rPr>
-          <w:rFonts w:ascii="Courier New" w:hAnsi="Courier New"/>
-          <w:color w:val="004000"/>
-          <w:sz w:val="17"/>
-        </w:rPr>
-        <w:t>Build DroidBridge — an ADB-powered Android device management tool.</w:t>
-        <w:br/>
-        <w:br/>
-        <w:t>FIRST STEP — READ THE FULL SPECIFICATION:</w:t>
-        <w:br/>
-        <w:t>Before writing any code, read the entire DroidBridge_Project_Document.md file</w:t>
-        <w:br/>
-        <w:t>in this directory from top to bottom. It contains the full project overview,</w:t>
-        <w:br/>
-        <w:t>design principles, tech stack, platform strategy, all 9 module specifications</w:t>
-        <w:br/>
-        <w:t>in detail (especially Module 4 — WhatsApp Toolkit), the CLI and GUI interface</w:t>
-        <w:br/>
-        <w:t>specs, non-functional requirements, and the 6-phase implementation plan.</w:t>
-        <w:br/>
-        <w:t>Confirm you understand the project scope before starting Phase 1. Refer back</w:t>
-        <w:br/>
-        <w:t>to this document throughout development — it is the source of truth for all</w:t>
-        <w:br/>
-        <w:t>features, folder structures, CLI commands, and exit criteria per phase.</w:t>
-        <w:br/>
-        <w:br/>
-        <w:t>PROJECT STRUCTURE:</w:t>
-        <w:br/>
-        <w:t>Create a Python project with the following layout:</w:t>
-        <w:br/>
-        <w:br/>
-        <w:t>droidbridge/</w:t>
-        <w:br/>
-        <w:t xml:space="preserve">  core/          # ADB wrapper, device management</w:t>
-        <w:br/>
-        <w:t xml:space="preserve">  modules/       # One file per module (whatsapp, storage, backup, etc.)</w:t>
-        <w:br/>
-        <w:t xml:space="preserve">  cli/           # Click-based CLI entry points</w:t>
-        <w:br/>
-        <w:t xml:space="preserve">  gui/           # PyQt6 GUI (optional, separate entry point)</w:t>
-        <w:br/>
-        <w:t xml:space="preserve">  reports/       # Report generators (TXT, HTML, CSV, JSON)</w:t>
-        <w:br/>
-        <w:t xml:space="preserve">  utils/         # Shared helpers (date parsing, size formatting, etc.)</w:t>
-        <w:br/>
-        <w:br/>
-        <w:t>IMPLEMENTATION APPROACH — follow these phases in order, do not skip ahead:</w:t>
-        <w:br/>
-        <w:br/>
-        <w:t>PHASE 1 — Foundation:</w:t>
-        <w:br/>
-        <w:t>Implement core/adb.py (ADB wrapper for devices/shell/pull/push with error</w:t>
-        <w:br/>
-        <w:t>handling) and Module 1 (Device Manager: detection, info, storage breakdown,</w:t>
-        <w:br/>
-        <w:t>connection health). Add CLI commands: device info, device connect. Bundle</w:t>
-        <w:br/>
-        <w:t>Linux ADB binary first.</w:t>
-        <w:br/>
-        <w:br/>
-        <w:t>PHASE 2 — File Operations:</w:t>
-        <w:br/>
-        <w:t>Implement Module 2 (File Browser), Module 7 (Search &amp; Discovery), and Module 3</w:t>
-        <w:br/>
-        <w:t>(Smart Transfer Engine) with batch ADB pull/push (500 files per call), progress</w:t>
-        <w:br/>
-        <w:t>tracking, conflict resolution, post-transfer verification, and resume support.</w:t>
-        <w:br/>
-        <w:t>Add Linux sleep inhibitor (systemd-inhibit). CLI: files browse/search,</w:t>
-        <w:br/>
-        <w:t>transfer pull/push.</w:t>
-        <w:br/>
-        <w:br/>
-        <w:t>PHASE 3 — WhatsApp Toolkit (highest priority, largest phase):</w:t>
-        <w:br/>
-        <w:t>Implement Module 4 in 5 sub-steps:</w:t>
-        <w:br/>
-        <w:t xml:space="preserve">  (a) Analysis: auto-detect WhatsApp/WhatsApp Business media paths, scan all</w:t>
-        <w:br/>
-        <w:t xml:space="preserve">      14 media folder types, report by folder/section/year/month/extension,</w:t>
-        <w:br/>
-        <w:t xml:space="preserve">      pre/post cutoff comparison. (Orphaned media detection: out of scope on</w:t>
-        <w:br/>
-        <w:t xml:space="preserve">      non-rooted devices, see §4.1 caveat.)</w:t>
-        <w:br/>
-        <w:t xml:space="preserve">  (b) Backup: full/selective backup using Phase 2 transfer engine,</w:t>
-        <w:br/>
-        <w:t xml:space="preserve">      direct-to-external-drive, post-backup verification, session logs.</w:t>
-        <w:br/>
-        <w:t xml:space="preserve">  (c) Organization (OPTIONAL step, not automatic): organize-by-date for</w:t>
-        <w:br/>
-        <w:t xml:space="preserve">      Voice Notes/Images/Video, organize-by-category for Documents,</w:t>
-        <w:br/>
-        <w:t xml:space="preserve">      MIME-type extension fixing, double-dot filename fixing, bad year</w:t>
-        <w:br/>
-        <w:t xml:space="preserve">      folder correction.</w:t>
-        <w:br/>
-        <w:t xml:space="preserve">  (d) Cleanup: pre-deletion preview, keep/delete rules, mandatory typed</w:t>
-        <w:br/>
-        <w:t xml:space="preserve">      'YES DELETE' confirmation, batch deletion (500/call), resume via</w:t>
-        <w:br/>
-        <w:t xml:space="preserve">      rescan, post-deletion verification, block deletion if backup unverified.</w:t>
-        <w:br/>
-        <w:t xml:space="preserve">  (e) Database: backup Databases/, Backups/, accounts/ folders.</w:t>
-        <w:br/>
-        <w:t>CLI: whatsapp scan/analyze/backup/organize/delete/backup-db.</w:t>
-        <w:br/>
-        <w:br/>
-        <w:t>PHASE 4 — Storage, Apps, Backup Manager + Cross-Platform:</w:t>
-        <w:br/>
-        <w:t>Implement Module 5 (Storage Analyzer), Module 8 (App Manager), Module 6</w:t>
-        <w:br/>
-        <w:t>(Backup Manager with profiles/incremental/restore). Add core/platform/</w:t>
-        <w:br/>
-        <w:t>abstraction layer (windows.py, linux.py, macos.py), bundle Windows and macOS</w:t>
-        <w:br/>
-        <w:t>ADB binaries, add Windows/macOS sleep inhibitors. Test full CLI on all 3</w:t>
-        <w:br/>
-        <w:t>platforms.</w:t>
-        <w:br/>
-        <w:br/>
-        <w:t>PHASE 5 — Reports &amp; Analysis:</w:t>
-        <w:br/>
-        <w:t>Implement Module 9 with TXT/HTML/CSV/JSON report generators reused by all</w:t>
-        <w:br/>
-        <w:t>modules, unify session log structure, add storage trend comparison across</w:t>
-        <w:br/>
-        <w:t>sessions. CLI: report generate --format.</w:t>
-        <w:br/>
-        <w:br/>
-        <w:t>PHASE 6 — GUI &amp; Packaging:</w:t>
-        <w:br/>
-        <w:t>Build PyQt6 GUI with sidebar navigation for all 9 modules, calling the same</w:t>
-        <w:br/>
-        <w:t>core/modules logic as CLI (no duplication). Add progress/confirmation dialogs,</w:t>
-        <w:br/>
-        <w:t>dark/light mode. Produce PyInstaller executables for Windows, Linux, macOS.</w:t>
-        <w:br/>
-        <w:br/>
-        <w:t>KEY TECHNICAL REQUIREMENTS:</w:t>
-        <w:br/>
-        <w:t>- Single Python codebase shared across platforms; platform differences</w:t>
-        <w:br/>
-        <w:t xml:space="preserve">  isolated in core/platform/</w:t>
-        <w:br/>
-        <w:t>- Bundle ADB platform-tools per platform (Linux first in Phase 1,</w:t>
-        <w:br/>
-        <w:t xml:space="preserve">  Windows/macOS in Phase 4)</w:t>
-        <w:br/>
-        <w:t>- Backup organization (by date for media, by category for documents) is</w:t>
-        <w:br/>
-        <w:t xml:space="preserve">  OPTIONAL — a separate user-triggered step, never automatic</w:t>
-        <w:br/>
-        <w:t>- All destructive operations require verified backup + explicit typed</w:t>
-        <w:br/>
-        <w:t xml:space="preserve">  'YES DELETE' confirmation</w:t>
-        <w:br/>
-        <w:t>- Batch ADB commands (500 files per rm call) for fast deletion</w:t>
-        <w:br/>
-        <w:t>- Sleep inhibitor during long transfers (systemd-inhibit on Linux; add</w:t>
-        <w:br/>
-        <w:t xml:space="preserve">  Windows/macOS in Phase 4)</w:t>
-        <w:br/>
-        <w:t>- WhatsApp path auto-detection for both com.whatsapp and com.whatsapp.w4b</w:t>
-        <w:br/>
-        <w:t xml:space="preserve">  (supports Android 8–14)</w:t>
-        <w:br/>
-        <w:t>- Date validation: year 2009–2030, month 01–12, reject false matches from</w:t>
-        <w:br/>
-        <w:t xml:space="preserve">  serial numbers/student IDs</w:t>
-        <w:br/>
-        <w:t>- MIME type detection for files with missing/wrong extensions</w:t>
-        <w:br/>
-        <w:t>- All operations resumable after interruption (transfers and deletions)</w:t>
-        <w:br/>
-        <w:t>- Fully offline — no internet, no cloud, no telemetry</w:t>
-        <w:br/>
-        <w:t>- Open source, MIT license</w:t>
-        <w:br/>
-        <w:br/>
-        <w:t>START WITH PHASE 1 RIGHT NOW:</w:t>
-        <w:br/>
-        <w:t>1. Create the project structure and requirements.txt (click, etc.)</w:t>
-        <w:br/>
-        <w:t>2. Implement core/adb.py — the ADB wrapper with devices/shell/pull/push and</w:t>
-        <w:br/>
-        <w:t xml:space="preserve">   error handling</w:t>
-        <w:br/>
-        <w:t>3. Implement modules/device.py — Module 1 (Device Manager)</w:t>
-        <w:br/>
-        <w:t>4. Implement cli/main.py — Click-based CLI entry point with 'device info'</w:t>
-        <w:br/>
-        <w:t xml:space="preserve">   and 'device connect' commands</w:t>
-        <w:br/>
-        <w:t>5. Test against a real connected Android device before moving to Phase 2</w:t>
-      </w:r>
-    </w:p>
-    <w:p>
-      <w:pPr>
-        <w:spacing w:after="80" w:before="40"/>
-        <w:ind w:left="504"/>
-      </w:pPr>
-      <w:r>
-        <w:rPr>
-          <w:i/>
-        </w:rPr>
-        <w:t>This document was generated as part of the DroidBridge open source project specification. Start with Phase 1 and progress sequentially — the WhatsApp Toolkit (Phase 3) contains the most complex and battle-tested logic.</w:t>
       </w:r>
     </w:p>
     <w:p>

</xml_diff>

<commit_message>
docs: add architecture overview and developer section
§21 Architecture Overview: shared-core/dual-interface design explained
with ASCII diagrams for the CLI stack, GUI stack (Page → Worker →
Module → ADB), and a layered component map (Presentation / Application
/ Infrastructure / Device).

§22 About the Developer: Ali Elmansoury — Junior Embedded Software /
Android Automotive Engineer — with email, GitHub, and LinkedIn.

.docx regenerated (61 KB) with both new sections included.

Co-Authored-By: Claude Sonnet 4.6 <noreply@anthropic.com>
</commit_message>
<xml_diff>
--- a/docs/DroidBridge_Project_Document.docx
+++ b/docs/DroidBridge_Project_Document.docx
@@ -11216,6 +11216,549 @@
           <w:bottom w:val="single" w:sz="6" w:space="4" w:color="CCCCCC"/>
         </w:pBdr>
       </w:pPr>
+    </w:p>
+    <w:p>
+      <w:pPr>
+        <w:spacing w:before="80" w:after="80"/>
+        <w:pBdr>
+          <w:bottom w:val="single" w:sz="6" w:space="4" w:color="CCCCCC"/>
+        </w:pBdr>
+      </w:pPr>
+    </w:p>
+    <w:p>
+      <w:pPr>
+        <w:pStyle w:val="Heading2"/>
+        <w:jc w:val="left"/>
+        <w:pBdr>
+          <w:bottom w:val="single" w:sz="4" w:space="4" w:color="CCCCCC"/>
+        </w:pBdr>
+      </w:pPr>
+      <w:r>
+        <w:t>21. Architecture Overview</w:t>
+      </w:r>
+    </w:p>
+    <w:p>
+      <w:pPr>
+        <w:spacing w:after="120"/>
+      </w:pPr>
+      <w:r>
+        <w:t xml:space="preserve">DroidBridge uses a </w:t>
+      </w:r>
+      <w:r>
+        <w:rPr>
+          <w:b/>
+        </w:rPr>
+        <w:t>shared-core, dual-interface</w:t>
+      </w:r>
+      <w:r>
+        <w:t xml:space="preserve"> architecture: both the CLI and the GUI call the same Python modules — no logic is duplicated. The only difference is the presentation layer.</w:t>
+      </w:r>
+    </w:p>
+    <w:p>
+      <w:pPr>
+        <w:pStyle w:val="Heading3"/>
+      </w:pPr>
+      <w:r>
+        <w:t>21.1 Shared Core</w:t>
+      </w:r>
+    </w:p>
+    <w:p>
+      <w:pPr>
+        <w:spacing w:before="80" w:after="80"/>
+        <w:ind w:left="288" w:right="288"/>
+        <w:shd w:val="clear" w:color="auto" w:fill="1E2D3D"/>
+      </w:pPr>
+      <w:r>
+        <w:rPr>
+          <w:rFonts w:ascii="Courier New" w:hAnsi="Courier New"/>
+          <w:color w:val="D4D4D4"/>
+          <w:sz w:val="17"/>
+        </w:rPr>
+        <w:t>droidbridge/</w:t>
+        <w:br/>
+        <w:t xml:space="preserve">  core/</w:t>
+        <w:br/>
+        <w:t xml:space="preserve">    adb.py          # ADB wrapper: devices(), shell(), pull(), push()</w:t>
+        <w:br/>
+        <w:t xml:space="preserve">    platform/       # OS-specific sleep inhibitor, path helpers</w:t>
+        <w:br/>
+        <w:t xml:space="preserve">  modules/</w:t>
+        <w:br/>
+        <w:t xml:space="preserve">    device.py       # Module 1 — Device Manager</w:t>
+        <w:br/>
+        <w:t xml:space="preserve">    files.py        # Module 2 — File Browser</w:t>
+        <w:br/>
+        <w:t xml:space="preserve">    transfer.py     # Module 3 — Smart Transfer Engine</w:t>
+        <w:br/>
+        <w:t xml:space="preserve">    whatsapp.py     # Module 4 — WhatsApp Toolkit</w:t>
+        <w:br/>
+        <w:t xml:space="preserve">    storage.py      # Module 5 — Storage Analyzer</w:t>
+        <w:br/>
+        <w:t xml:space="preserve">    backup.py       # Module 6 — Backup Manager</w:t>
+        <w:br/>
+        <w:t xml:space="preserve">    search.py       # Module 7 — Search &amp; Discovery</w:t>
+        <w:br/>
+        <w:t xml:space="preserve">    apps.py         # Module 8 — App Manager</w:t>
+        <w:br/>
+        <w:t xml:space="preserve">    reports.py      # Module 9 — Reports &amp; Analysis</w:t>
+        <w:br/>
+        <w:t xml:space="preserve">  reports/          # TXT / HTML / CSV / JSON generators</w:t>
+        <w:br/>
+        <w:t xml:space="preserve">  utils/            # Size formatting, date parsing, helpers</w:t>
+      </w:r>
+    </w:p>
+    <w:p>
+      <w:pPr>
+        <w:pStyle w:val="Heading3"/>
+      </w:pPr>
+      <w:r>
+        <w:t>21.2 CLI Architecture</w:t>
+      </w:r>
+    </w:p>
+    <w:p>
+      <w:pPr>
+        <w:spacing w:before="80" w:after="80"/>
+        <w:ind w:left="288" w:right="288"/>
+        <w:shd w:val="clear" w:color="auto" w:fill="1E2D3D"/>
+      </w:pPr>
+      <w:r>
+        <w:rPr>
+          <w:rFonts w:ascii="Courier New" w:hAnsi="Courier New"/>
+          <w:color w:val="D4D4D4"/>
+          <w:sz w:val="17"/>
+        </w:rPr>
+        <w:t xml:space="preserve">  User Terminal</w:t>
+        <w:br/>
+        <w:t xml:space="preserve">       |</w:t>
+        <w:br/>
+        <w:t xml:space="preserve">  droidbridge &lt;command&gt; [args]       (cli/main.py — Click framework)</w:t>
+        <w:br/>
+        <w:t xml:space="preserve">       |</w:t>
+        <w:br/>
+        <w:t xml:space="preserve">  +----------+----------+-----------+----------+----------+</w:t>
+        <w:br/>
+        <w:t xml:space="preserve">  | device   | files    | transfer  | whatsapp | storage  |</w:t>
+        <w:br/>
+        <w:t xml:space="preserve">  | connect  | browse   | pull/push | scan     | analyze  |</w:t>
+        <w:br/>
+        <w:t xml:space="preserve">  | info     | search   |           | backup   | large    |</w:t>
+        <w:br/>
+        <w:t xml:space="preserve">  |          |          |           | organize | apps     |</w:t>
+        <w:br/>
+        <w:t xml:space="preserve">  |          |          |           | delete   |          |</w:t>
+        <w:br/>
+        <w:t xml:space="preserve">  +----------+----------+-----------+----------+----------+</w:t>
+        <w:br/>
+        <w:t xml:space="preserve">                              |</w:t>
+        <w:br/>
+        <w:t xml:space="preserve">                    Core Modules (shared)</w:t>
+        <w:br/>
+        <w:t xml:space="preserve">                    modules/*.py</w:t>
+        <w:br/>
+        <w:t xml:space="preserve">                              |</w:t>
+        <w:br/>
+        <w:t xml:space="preserve">                         core/adb.py           (ADB Wrapper)</w:t>
+        <w:br/>
+        <w:t xml:space="preserve">                              |</w:t>
+        <w:br/>
+        <w:t xml:space="preserve">                    platform-tools/adb         (bundled binary)</w:t>
+        <w:br/>
+        <w:t xml:space="preserve">                              |</w:t>
+        <w:br/>
+        <w:t xml:space="preserve">                       Android Device          (USB)</w:t>
+      </w:r>
+    </w:p>
+    <w:p>
+      <w:pPr>
+        <w:spacing w:after="120"/>
+      </w:pPr>
+      <w:r>
+        <w:rPr>
+          <w:b/>
+        </w:rPr>
+        <w:t>Data flow:</w:t>
+      </w:r>
+      <w:r>
+        <w:t xml:space="preserve"> the CLI handler validates user input, calls the relevant module function, and prints the returned data structure. All output goes to stdout; session logs go to </w:t>
+      </w:r>
+      <w:r>
+        <w:rPr>
+          <w:rFonts w:ascii="Courier New" w:hAnsi="Courier New"/>
+          <w:sz w:val="19"/>
+        </w:rPr>
+        <w:t>session_logs/</w:t>
+      </w:r>
+      <w:r>
+        <w:t>. No GUI state is touched.</w:t>
+      </w:r>
+    </w:p>
+    <w:p>
+      <w:pPr>
+        <w:pStyle w:val="Heading3"/>
+      </w:pPr>
+      <w:r>
+        <w:t>21.3 GUI Architecture</w:t>
+      </w:r>
+    </w:p>
+    <w:p>
+      <w:pPr>
+        <w:spacing w:before="80" w:after="80"/>
+        <w:ind w:left="288" w:right="288"/>
+        <w:shd w:val="clear" w:color="auto" w:fill="1E2D3D"/>
+      </w:pPr>
+      <w:r>
+        <w:rPr>
+          <w:rFonts w:ascii="Courier New" w:hAnsi="Courier New"/>
+          <w:color w:val="D4D4D4"/>
+          <w:sz w:val="17"/>
+        </w:rPr>
+        <w:t xml:space="preserve">  User (mouse / keyboard)</w:t>
+        <w:br/>
+        <w:t xml:space="preserve">         |</w:t>
+        <w:br/>
+        <w:t xml:space="preserve">   MainWindow (PyQt6)              gui/main_window.py</w:t>
+        <w:br/>
+        <w:t xml:space="preserve">   |  Sidebar (QListWidget)        9 module entries + About</w:t>
+        <w:br/>
+        <w:t xml:space="preserve">   |  QStackedWidget               one Page per module</w:t>
+        <w:br/>
+        <w:t xml:space="preserve">   |  DeviceContext                shared ADB state (serial, model)</w:t>
+        <w:br/>
+        <w:t xml:space="preserve">   |  LogPanel                     live session log viewer</w:t>
+        <w:br/>
+        <w:t xml:space="preserve">         |</w:t>
+        <w:br/>
+        <w:t xml:space="preserve">   Page (active module)            gui/pages/*.py</w:t>
+        <w:br/>
+        <w:t xml:space="preserve">   |  Signals / Slots              Qt event bus</w:t>
+        <w:br/>
+        <w:t xml:space="preserve">   |  QTableWidget / QTreeWidget   results display</w:t>
+        <w:br/>
+        <w:t xml:space="preserve">   |  Export button                CSV / TXT / HTML / JSON</w:t>
+        <w:br/>
+        <w:t xml:space="preserve">         |</w:t>
+        <w:br/>
+        <w:t xml:space="preserve">   Worker (QThread)                gui/workers/*.py</w:t>
+        <w:br/>
+        <w:t xml:space="preserve">   |  progress / result signals    emitted back to the Page</w:t>
+        <w:br/>
+        <w:t xml:space="preserve">   |  cancel support               via _cancelled flag</w:t>
+        <w:br/>
+        <w:t xml:space="preserve">         |</w:t>
+        <w:br/>
+        <w:t xml:space="preserve">   Core Modules (shared)           modules/*.py</w:t>
+        <w:br/>
+        <w:t xml:space="preserve">         |</w:t>
+        <w:br/>
+        <w:t xml:space="preserve">   core/adb.py                     (ADB Wrapper — same as CLI)</w:t>
+        <w:br/>
+        <w:t xml:space="preserve">         |</w:t>
+        <w:br/>
+        <w:t xml:space="preserve">   Android Device (USB)</w:t>
+      </w:r>
+    </w:p>
+    <w:p>
+      <w:pPr>
+        <w:spacing w:after="120"/>
+      </w:pPr>
+      <w:r>
+        <w:rPr>
+          <w:b/>
+        </w:rPr>
+        <w:t>Key design rule:</w:t>
+      </w:r>
+      <w:r>
+        <w:t xml:space="preserve"> workers and pages never call </w:t>
+      </w:r>
+      <w:r>
+        <w:rPr>
+          <w:rFonts w:ascii="Courier New" w:hAnsi="Courier New"/>
+          <w:sz w:val="19"/>
+        </w:rPr>
+        <w:t>adb</w:t>
+      </w:r>
+      <w:r>
+        <w:t xml:space="preserve"> directly — they always go through </w:t>
+      </w:r>
+      <w:r>
+        <w:rPr>
+          <w:rFonts w:ascii="Courier New" w:hAnsi="Courier New"/>
+          <w:sz w:val="19"/>
+        </w:rPr>
+        <w:t>core/adb.py</w:t>
+      </w:r>
+      <w:r>
+        <w:t>. This means every operation is automatically testable from the CLI without running the GUI.</w:t>
+      </w:r>
+    </w:p>
+    <w:p>
+      <w:pPr>
+        <w:pStyle w:val="Heading3"/>
+      </w:pPr>
+      <w:r>
+        <w:t>21.4 Layered Component Map</w:t>
+      </w:r>
+    </w:p>
+    <w:p>
+      <w:pPr>
+        <w:spacing w:before="80" w:after="80"/>
+        <w:ind w:left="288" w:right="288"/>
+        <w:shd w:val="clear" w:color="auto" w:fill="1E2D3D"/>
+      </w:pPr>
+      <w:r>
+        <w:rPr>
+          <w:rFonts w:ascii="Courier New" w:hAnsi="Courier New"/>
+          <w:color w:val="D4D4D4"/>
+          <w:sz w:val="17"/>
+        </w:rPr>
+        <w:t xml:space="preserve">  ┌──────────────────────────────────────────────────────┐</w:t>
+        <w:br/>
+        <w:t xml:space="preserve">  │  Presentation Layer                                   │</w:t>
+        <w:br/>
+        <w:t xml:space="preserve">  │  CLI (Click)              GUI (PyQt6)                │</w:t>
+        <w:br/>
+        <w:t xml:space="preserve">  └──────────────┬───────────────────┬───────────────────┘</w:t>
+        <w:br/>
+        <w:t xml:space="preserve">                 │                   │</w:t>
+        <w:br/>
+        <w:t xml:space="preserve">  ┌──────────────▼───────────────────▼───────────────────┐</w:t>
+        <w:br/>
+        <w:t xml:space="preserve">  │  Application Layer                                    │</w:t>
+        <w:br/>
+        <w:t xml:space="preserve">  │  modules/device  modules/whatsapp  modules/storage   │</w:t>
+        <w:br/>
+        <w:t xml:space="preserve">  │  modules/files   modules/search    modules/apps      │</w:t>
+        <w:br/>
+        <w:t xml:space="preserve">  │  modules/backup  modules/reports   modules/transfer  │</w:t>
+        <w:br/>
+        <w:t xml:space="preserve">  └──────────────────────────┬───────────────────────────┘</w:t>
+        <w:br/>
+        <w:t xml:space="preserve">                             │</w:t>
+        <w:br/>
+        <w:t xml:space="preserve">  ┌──────────────────────────▼───────────────────────────┐</w:t>
+        <w:br/>
+        <w:t xml:space="preserve">  │  Infrastructure Layer                                 │</w:t>
+        <w:br/>
+        <w:t xml:space="preserve">  │  core/adb.py      core/platform/      utils/         │</w:t>
+        <w:br/>
+        <w:t xml:space="preserve">  │  reports/ (formatters)   session_logs/               │</w:t>
+        <w:br/>
+        <w:t xml:space="preserve">  └──────────────────────────┬───────────────────────────┘</w:t>
+        <w:br/>
+        <w:t xml:space="preserve">                             │  USB  (ADB protocol)</w:t>
+        <w:br/>
+        <w:t xml:space="preserve">  ┌──────────────────────────▼───────────────────────────┐</w:t>
+        <w:br/>
+        <w:t xml:space="preserve">  │  Android Device                                       │</w:t>
+        <w:br/>
+        <w:t xml:space="preserve">  │  bundled platform-tools/adb  (Google v37.0.0)        │</w:t>
+        <w:br/>
+        <w:t xml:space="preserve">  └──────────────────────────────────────────────────────┘</w:t>
+      </w:r>
+    </w:p>
+    <w:p>
+      <w:pPr>
+        <w:spacing w:before="80" w:after="80"/>
+        <w:pBdr>
+          <w:bottom w:val="single" w:sz="6" w:space="4" w:color="CCCCCC"/>
+        </w:pBdr>
+      </w:pPr>
+    </w:p>
+    <w:p>
+      <w:pPr>
+        <w:pStyle w:val="Heading2"/>
+        <w:jc w:val="left"/>
+        <w:pBdr>
+          <w:bottom w:val="single" w:sz="4" w:space="4" w:color="CCCCCC"/>
+        </w:pBdr>
+      </w:pPr>
+      <w:r>
+        <w:t>22. About the Developer</w:t>
+      </w:r>
+    </w:p>
+    <w:p>
+      <w:pPr>
+        <w:spacing w:after="120"/>
+      </w:pPr>
+      <w:r>
+        <w:t>DroidBridge was designed and built by:</w:t>
+      </w:r>
+    </w:p>
+    <w:tbl>
+      <w:tblPr>
+        <w:tblStyle w:val="TableGrid"/>
+        <w:tblW w:type="auto" w:w="0"/>
+        <w:tblLook w:firstColumn="1" w:firstRow="1" w:lastColumn="0" w:lastRow="0" w:noHBand="0" w:noVBand="1" w:val="04A0"/>
+      </w:tblPr>
+      <w:tblGrid>
+        <w:gridCol w:w="4320"/>
+        <w:gridCol w:w="4320"/>
+      </w:tblGrid>
+      <w:tr>
+        <w:tc>
+          <w:tcPr>
+            <w:tcW w:type="dxa" w:w="4320"/>
+            <w:shd w:val="clear" w:color="auto" w:fill="1F497D"/>
+          </w:tcPr>
+          <w:p>
+            <w:r>
+              <w:rPr>
+                <w:b/>
+                <w:color w:val="FFFFFF"/>
+                <w:sz w:val="22"/>
+              </w:rPr>
+              <w:t>Field</w:t>
+            </w:r>
+          </w:p>
+        </w:tc>
+        <w:tc>
+          <w:tcPr>
+            <w:tcW w:type="dxa" w:w="4320"/>
+            <w:shd w:val="clear" w:color="auto" w:fill="1F497D"/>
+          </w:tcPr>
+          <w:p>
+            <w:r>
+              <w:rPr>
+                <w:b/>
+                <w:color w:val="FFFFFF"/>
+                <w:sz w:val="22"/>
+              </w:rPr>
+              <w:t>Details</w:t>
+            </w:r>
+          </w:p>
+        </w:tc>
+      </w:tr>
+      <w:tr>
+        <w:tc>
+          <w:tcPr>
+            <w:tcW w:type="dxa" w:w="4320"/>
+          </w:tcPr>
+          <w:p>
+            <w:r>
+              <w:t>Name</w:t>
+            </w:r>
+          </w:p>
+        </w:tc>
+        <w:tc>
+          <w:tcPr>
+            <w:tcW w:type="dxa" w:w="4320"/>
+          </w:tcPr>
+          <w:p>
+            <w:r>
+              <w:t>Ali Elmansoury</w:t>
+            </w:r>
+          </w:p>
+        </w:tc>
+      </w:tr>
+      <w:tr>
+        <w:tc>
+          <w:tcPr>
+            <w:tcW w:type="dxa" w:w="4320"/>
+          </w:tcPr>
+          <w:p>
+            <w:r>
+              <w:t>Title</w:t>
+            </w:r>
+          </w:p>
+        </w:tc>
+        <w:tc>
+          <w:tcPr>
+            <w:tcW w:type="dxa" w:w="4320"/>
+          </w:tcPr>
+          <w:p>
+            <w:r>
+              <w:t>Junior Embedded Software / Android Automotive Engineer</w:t>
+            </w:r>
+          </w:p>
+        </w:tc>
+      </w:tr>
+      <w:tr>
+        <w:tc>
+          <w:tcPr>
+            <w:tcW w:type="dxa" w:w="4320"/>
+          </w:tcPr>
+          <w:p>
+            <w:r>
+              <w:t>Email</w:t>
+            </w:r>
+          </w:p>
+        </w:tc>
+        <w:tc>
+          <w:tcPr>
+            <w:tcW w:type="dxa" w:w="4320"/>
+          </w:tcPr>
+          <w:p>
+            <w:r>
+              <w:t>ali.elmansoury21@gmail.com</w:t>
+            </w:r>
+          </w:p>
+        </w:tc>
+      </w:tr>
+      <w:tr>
+        <w:tc>
+          <w:tcPr>
+            <w:tcW w:type="dxa" w:w="4320"/>
+          </w:tcPr>
+          <w:p>
+            <w:r>
+              <w:t>GitHub</w:t>
+            </w:r>
+          </w:p>
+        </w:tc>
+        <w:tc>
+          <w:tcPr>
+            <w:tcW w:type="dxa" w:w="4320"/>
+          </w:tcPr>
+          <w:p>
+            <w:r>
+              <w:t>https://github.com/Ali-Elmansoury</w:t>
+            </w:r>
+          </w:p>
+        </w:tc>
+      </w:tr>
+      <w:tr>
+        <w:tc>
+          <w:tcPr>
+            <w:tcW w:type="dxa" w:w="4320"/>
+          </w:tcPr>
+          <w:p>
+            <w:r>
+              <w:t>LinkedIn</w:t>
+            </w:r>
+          </w:p>
+        </w:tc>
+        <w:tc>
+          <w:tcPr>
+            <w:tcW w:type="dxa" w:w="4320"/>
+          </w:tcPr>
+          <w:p>
+            <w:r>
+              <w:t>https://www.linkedin.com/in/ali-elmansoury/</w:t>
+            </w:r>
+          </w:p>
+        </w:tc>
+      </w:tr>
+    </w:tbl>
+    <w:p>
+      <w:pPr>
+        <w:spacing w:after="80"/>
+      </w:pPr>
+    </w:p>
+    <w:p>
+      <w:pPr>
+        <w:spacing w:after="120"/>
+      </w:pPr>
+      <w:r>
+        <w:t>DroidBridge grew out of a personal frustration with the painfully slow MTP transfers and the lack of good offline tools for managing large WhatsApp media archives on Android devices. Every feature in the tool was driven by real-world usage on real data.</w:t>
+      </w:r>
+    </w:p>
+    <w:p>
+      <w:pPr>
+        <w:spacing w:after="120"/>
+      </w:pPr>
+      <w:r>
+        <w:t>The project is open source (MIT License). Contributions, issues, and feedback are welcome on GitHub.</w:t>
+      </w:r>
     </w:p>
     <w:sectPr>
       <w:footerReference w:type="default" r:id="rId9"/>

</xml_diff>

<commit_message>
docs: make title-page blue bar taller and centered
Increase bar font size from 5pt to 18pt (taller shaded block) and
center it between symmetric 1.5" margins so it sits as a proper
separator between the tagline and the document-type subtitle.

Co-Authored-By: Claude Sonnet 4.6 <noreply@anthropic.com>
</commit_message>
<xml_diff>
--- a/docs/DroidBridge_Project_Document.docx
+++ b/docs/DroidBridge_Project_Document.docx
@@ -80,14 +80,14 @@
     </w:p>
     <w:p>
       <w:pPr>
-        <w:spacing w:before="0" w:after="280"/>
-        <w:ind w:left="0" w:right="5040"/>
-        <w:jc w:val="left"/>
+        <w:spacing w:before="80" w:after="280"/>
+        <w:ind w:left="2160" w:right="2160"/>
+        <w:jc w:val="center"/>
         <w:shd w:val="clear" w:color="auto" w:fill="2E75B6"/>
       </w:pPr>
       <w:r>
         <w:rPr>
-          <w:sz w:val="10"/>
+          <w:sz w:val="36"/>
         </w:rPr>
         <w:t xml:space="preserve"> </w:t>
       </w:r>

</xml_diff>

<commit_message>
docs: regenerate docx and PDFs with v1.0.3 version stamp; update .gitignore
Co-Authored-By: Claude Sonnet 4.6 <noreply@anthropic.com>
</commit_message>
<xml_diff>
--- a/docs/DroidBridge_Project_Document.docx
+++ b/docs/DroidBridge_Project_Document.docx
@@ -115,7 +115,7 @@
           <w:color w:val="595959"/>
           <w:sz w:val="22"/>
         </w:rPr>
-        <w:t>Version 1.0.0 | Released June 2026</w:t>
+        <w:t>Version 1.0.3 | Released June 2026</w:t>
       </w:r>
     </w:p>
     <w:p>
@@ -128,7 +128,7 @@
           <w:color w:val="595959"/>
           <w:sz w:val="22"/>
         </w:rPr>
-        <w:t>Open Source Project (MIT License)</w:t>
+        <w:t>Proprietary Source-Available License</w:t>
       </w:r>
     </w:p>
     <w:p>
@@ -937,7 +937,7 @@
           </w:tcPr>
           <w:p>
             <w:r>
-              <w:t>Open source collaboration</w:t>
+              <w:t>Source control and collaboration</w:t>
             </w:r>
           </w:p>
         </w:tc>
@@ -7172,7 +7172,7 @@
           </w:tcPr>
           <w:p>
             <w:r>
-              <w:t>MIT Open Source License</w:t>
+              <w:t>Proprietary Source-Available — free for personal use, commercial license required for business use</w:t>
             </w:r>
           </w:p>
         </w:tc>
@@ -9511,7 +9511,7 @@
         <w:spacing w:after="120"/>
       </w:pPr>
       <w:r>
-        <w:t>offline, MIT, Android-focused CLI/GUI). If ever pursued, it would be a</w:t>
+        <w:t>offline, source-available, Android-focused CLI/GUI). If ever pursued, it would be a</w:t>
       </w:r>
     </w:p>
     <w:p>
@@ -11757,7 +11757,7 @@
         <w:spacing w:after="120"/>
       </w:pPr>
       <w:r>
-        <w:t>The project is open source (MIT License). Contributions, issues, and feedback are welcome on GitHub.</w:t>
+        <w:t>DroidBridge is released under a proprietary source-available license — free for personal use, with a commercial license required for business use. Source code is publicly visible on GitHub. Contributions, issues, and feedback are welcome.</w:t>
       </w:r>
     </w:p>
     <w:sectPr>

</xml_diff>